<commit_message>
aulas antigas e revisoes para prova de estrutura de dados
</commit_message>
<xml_diff>
--- a/3semestre/verificacao/TDE1-entrega1.docx
+++ b/3semestre/verificacao/TDE1-entrega1.docx
@@ -840,16 +840,14 @@
               <w:rPr>
                 <w:rFonts w:ascii="Arial" w:hAnsi="Arial" w:cs="Arial"/>
               </w:rPr>
-              <w:t xml:space="preserve">Número de </w:t>
+              <w:t>Número de méto</w:t>
             </w:r>
-            <w:proofErr w:type="spellStart"/>
             <w:r>
               <w:rPr>
                 <w:rFonts w:ascii="Arial" w:hAnsi="Arial" w:cs="Arial"/>
               </w:rPr>
-              <w:t>métofod</w:t>
+              <w:t>dos</w:t>
             </w:r>
-            <w:proofErr w:type="spellEnd"/>
           </w:p>
         </w:tc>
         <w:tc>
@@ -943,8 +941,32 @@
         <w:pStyle w:val="NormalWeb"/>
         <w:rPr>
           <w:rFonts w:ascii="Arial" w:hAnsi="Arial" w:cs="Arial"/>
-        </w:rPr>
-      </w:pPr>
+          <w:b/>
+          <w:bCs/>
+        </w:rPr>
+      </w:pPr>
+      <w:r>
+        <w:rPr>
+          <w:rFonts w:ascii="Arial" w:hAnsi="Arial" w:cs="Arial"/>
+          <w:b/>
+          <w:bCs/>
+        </w:rPr>
+        <w:t>1.4. Vídeo</w:t>
+      </w:r>
+    </w:p>
+    <w:p>
+      <w:pPr>
+        <w:pStyle w:val="NormalWeb"/>
+        <w:rPr>
+          <w:rFonts w:ascii="Arial" w:hAnsi="Arial" w:cs="Arial"/>
+        </w:rPr>
+      </w:pPr>
+      <w:r>
+        <w:rPr>
+          <w:rFonts w:ascii="Arial" w:hAnsi="Arial" w:cs="Arial"/>
+        </w:rPr>
+        <w:t>https://youtu.be/w4AiQV118yY</w:t>
+      </w:r>
     </w:p>
     <w:sectPr>
       <w:pgSz w:w="11906" w:h="16838"/>
@@ -2551,6 +2573,41 @@
       <w14:ligatures w14:val="none"/>
     </w:rPr>
   </w:style>
+  <w:style w:type="character" w:styleId="Hyperlink">
+    <w:name w:val="Hyperlink"/>
+    <w:basedOn w:val="Fontepargpadro"/>
+    <w:uiPriority w:val="99"/>
+    <w:unhideWhenUsed/>
+    <w:rsid w:val="00E4342D"/>
+    <w:rPr>
+      <w:color w:val="467886" w:themeColor="hyperlink"/>
+      <w:u w:val="single"/>
+    </w:rPr>
+  </w:style>
+  <w:style w:type="character" w:styleId="MenoPendente">
+    <w:name w:val="Unresolved Mention"/>
+    <w:basedOn w:val="Fontepargpadro"/>
+    <w:uiPriority w:val="99"/>
+    <w:semiHidden/>
+    <w:unhideWhenUsed/>
+    <w:rsid w:val="00E4342D"/>
+    <w:rPr>
+      <w:color w:val="605E5C"/>
+      <w:shd w:val="clear" w:color="auto" w:fill="E1DFDD"/>
+    </w:rPr>
+  </w:style>
+  <w:style w:type="character" w:styleId="HiperlinkVisitado">
+    <w:name w:val="FollowedHyperlink"/>
+    <w:basedOn w:val="Fontepargpadro"/>
+    <w:uiPriority w:val="99"/>
+    <w:semiHidden/>
+    <w:unhideWhenUsed/>
+    <w:rsid w:val="00E4342D"/>
+    <w:rPr>
+      <w:color w:val="96607D" w:themeColor="followedHyperlink"/>
+      <w:u w:val="single"/>
+    </w:rPr>
+  </w:style>
 </w:styles>
 </file>
 

</xml_diff>